<commit_message>
Support mock feedback for every question type
</commit_message>
<xml_diff>
--- a/mod/scorm/studytopic/samples/Real_Formula_Missing_Feedback_Mock_6_Book_Preview.docx
+++ b/mod/scorm/studytopic/samples/Real_Formula_Missing_Feedback_Mock_6_Book_Preview.docx
@@ -302,7 +302,7 @@
         <w:rPr>
           <w:color w:val="245B38"/>
         </w:rPr>
-        <w:t xml:space="preserve">For the ingredients of Ban Xia Xie Xin Tang (Pinellia decoction to drain the epigastrium), the source bank identifies Huang Lian (Coptidis Rhizoma); Huang Qin (Scutellariae Radix); Zhi Ban Xia (Pinelliae Rhizoma preparatum); Gan Jiang (Zingiberis Rhizoma); Ren Shen (Ginseng Radix); Da Zao (Jujubae Fructus); Zhi Gan Cao (Glycyrrhizae Radix preparata); as the correct answer. The original SCORM question does not contain a more detailed rationale.</w:t>
+        <w:t xml:space="preserve">For the ingredients of Ban Xia Xie Xin Tang (Pinellia decoction to drain the epigastrium), the source bank answer key is Huang Lian (Coptidis Rhizoma); Huang Qin (Scutellariae Radix); Zhi Ban Xia (Pinelliae Rhizoma preparatum); Gan Jiang (Zingiberis Rhizoma); Ren Shen (Ginseng Radix); Da Zao (Jujubae Fructus); Zhi Gan Cao (Glycyrrhizae Radix preparata);. The original SCORM question does not contain a more detailed rationale.</w:t>
       </w:r>
     </w:p>
     <w:p>
@@ -546,7 +546,7 @@
         <w:rPr>
           <w:color w:val="245B38"/>
         </w:rPr>
-        <w:t xml:space="preserve">For vigorous Heart fire injuring the blood and Yin, the source bank identifies Zhu Sha An Shen Wan (Cinnabar Pill to Calm the Spirit) as the correct answer. The original SCORM question does not contain a more detailed rationale.</w:t>
+        <w:t xml:space="preserve">For vigorous Heart fire injuring the blood and Yin, the source bank answer key is Zhu Sha An Shen Wan (Cinnabar Pill to Calm the Spirit). The original SCORM question does not contain a more detailed rationale.</w:t>
       </w:r>
     </w:p>
     <w:p>
@@ -773,7 +773,7 @@
           <w:b/>
           <w:color w:val="17324D"/>
         </w:rPr>
-        <w:t xml:space="preserve">Formula and pattern review</w:t>
+        <w:t xml:space="preserve">Source review</w:t>
       </w:r>
     </w:p>
     <w:p>
@@ -820,7 +820,7 @@
         <w:rPr>
           <w:color w:val="245B38"/>
         </w:rPr>
-        <w:t xml:space="preserve">For the clinical case described in the question, the source bank keys Wen Dan Tang (Warm the Gallbladder Decoction) as the correct answer. The formula-and-pattern review above is the rationale stored with this question.</w:t>
+        <w:t xml:space="preserve">For the clinical case described in the question, the source bank answer key is Wen Dan Tang (Warm the Gallbladder Decoction). The source review above is the rationale stored with this question.</w:t>
       </w:r>
     </w:p>
     <w:p>
@@ -1064,7 +1064,7 @@
         <w:rPr>
           <w:color w:val="245B38"/>
         </w:rPr>
-        <w:t xml:space="preserve">For Phlegm clogging the Lungs with Qi stagnation, the source bank identifies San Zi Yang Qin Tang (Three-Seed Decoction to Nourish One's Parents) as the correct answer. The original SCORM question does not contain a more detailed rationale.</w:t>
+        <w:t xml:space="preserve">For Phlegm clogging the Lungs with Qi stagnation, the source bank answer key is San Zi Yang Qin Tang (Three-Seed Decoction to Nourish One's Parents). The original SCORM question does not contain a more detailed rationale.</w:t>
       </w:r>
     </w:p>
     <w:p>
@@ -1291,7 +1291,7 @@
           <w:b/>
           <w:color w:val="17324D"/>
         </w:rPr>
-        <w:t xml:space="preserve">Formula and pattern review</w:t>
+        <w:t xml:space="preserve">Source review</w:t>
       </w:r>
     </w:p>
     <w:p>
@@ -1338,7 +1338,7 @@
         <w:rPr>
           <w:color w:val="245B38"/>
         </w:rPr>
-        <w:t xml:space="preserve">For the case, the source bank keys Bao He Wan (Preserve Harmony Pill) as the correct answer. The formula-and-pattern review above is the rationale stored with this question.</w:t>
+        <w:t xml:space="preserve">For the case, the source bank answer key is Bao He Wan (Preserve Harmony Pill). The source review above is the rationale stored with this question.</w:t>
       </w:r>
     </w:p>
     <w:p>
@@ -1582,7 +1582,7 @@
         <w:rPr>
           <w:color w:val="245B38"/>
         </w:rPr>
-        <w:t xml:space="preserve">For the NOT-correct statement requested in the question, the source bank identifies Zhi Gan Cao, harmonizes the actions of the other ingredients, combining with Gui Zhi and Sheng Jiang to transform The Yin aspects of the condition and with Bai Shao &amp;amp;amp; Da Zao to transform The Yang. as the correct answer. The original SCORM question does not contain a more detailed rationale.</w:t>
+        <w:t xml:space="preserve">For the NOT-correct statement requested in the question, the source bank answer key is Zhi Gan Cao, harmonizes the actions of the other ingredients, combining with Gui Zhi and Sheng Jiang to transform The Yin aspects of the condition and with Bai Shao &amp;amp;amp; Da Zao to transform The Yang.. The original SCORM question does not contain a more detailed rationale.</w:t>
       </w:r>
     </w:p>
     <w:p>

</xml_diff>